<commit_message>
Add reusable /tcc-minutes skill for generating minutes from Granola meetings
- render_minutes.py: data-driven .docx generator (TCC house style)
- SKILL.md: end-to-end routine (Granola -> select meeting -> transcript -> spec -> docx)
- spec.schema.md: JSON spec reference
- examples/: worked spec from the 9 Jun governance kick-off
</commit_message>
<xml_diff>
--- a/26'06'09 Governance Review Implementation Kick-off - Minutes (DRAFT).docx
+++ b/26'06'09 Governance Review Implementation Kick-off - Minutes (DRAFT).docx
@@ -706,7 +706,7 @@
           <w:b w:val="0"/>
           <w:i w:val="0"/>
         </w:rPr>
-        <w:t>The Committee discussed the appointment of an independent Non-Executive Director (NED) to the Trustee board. Meetings are scheduled this week (Thursday) with Tony McVeigh (2:00 PM) and Randall (1:00 PM / 9:00 AM). The Chair indicated Tony McVeigh is his preferred candidate — a recently retired Managing Partner of Hall &amp; Wilcox (retiring 30 June), with 20+ years’ experience, recommended by Andrew O’Brien and known to Farrel.</w:t>
+        <w:t>The Committee discussed the appointment of an independent Non-Executive Director (NED) to the Trustee board. Meetings are scheduled this week (Thursday) with Tony McVeigh (2:00 PM) and Randall (1:00 PM / 9:00 AM). The Chair indicated Tony McVeigh is his preferred candidate — a recently retired Managing Partner of Hall &amp; Wilcox (retiring 30 June), with 20+ years' experience, recommended by Andrew O'Brien and known to Farrel.</w:t>
       </w:r>
     </w:p>
     <w:p>
@@ -1063,7 +1063,7 @@
           <w:b w:val="0"/>
           <w:i w:val="0"/>
         </w:rPr>
-        <w:t>The Committee discussed the proposed appointment of Danny van Aswegen (former PwC valuation partner, now of Marketline; recommended by Farrel) as independent chair of the Valuation Committee. He is regarded as aligned with the Committee’s "golden thread" approach to valuation (≈60% consistency of investment storyline, 40% mechanics) and is familiar with comparable portfolios. His revised proposal: $20k for a review, $50k for a portfolio valuation review, and an as-yet unquoted fee for the independent role (estimated ≈$100k p.a. to do well).</w:t>
+        <w:t>The Committee discussed the proposed appointment of Danny van Aswegen (former PwC valuation partner, now of Marketline; recommended by Farrel) as independent chair of the Valuation Committee. He is regarded as aligned with the Committee's "golden thread" approach to valuation (≈60% consistency of investment storyline, 40% mechanics) and is familiar with comparable portfolios. His revised proposal: $20k for a review, $50k for a portfolio valuation review, and an as-yet unquoted fee for the independent role (estimated ≈$100k p.a. to do well).</w:t>
       </w:r>
     </w:p>
     <w:p>
@@ -1183,7 +1183,7 @@
           <w:b/>
           <w:i w:val="0"/>
         </w:rPr>
-        <w:t>RESOLUTION: Stephen Gledden to lead engagement with Yash and Kim Dema on valuation provider relationships, scope and budget analysis, to engage with the auditors (EY), and to revert to Danny van Aswegen — with the objective of a clear roadmap and avoiding duplication ahead of Thursday’s discussion. No cost commitment to be made until scope and end-goal are confirmed.</w:t>
+        <w:t>RESOLUTION: Stephen Gledden to lead engagement with Yash and Kim Dema on valuation provider relationships, scope and budget analysis, to engage with the auditors (EY), and to revert to Danny van Aswegen — with the objective of a clear roadmap and avoiding duplication ahead of Thursday's discussion. No cost commitment to be made until scope and end-goal are confirmed.</w:t>
       </w:r>
     </w:p>
     <w:p>
@@ -1255,7 +1255,7 @@
           <w:b w:val="0"/>
           <w:i w:val="0"/>
         </w:rPr>
-        <w:t>It was noted that, at current scale, a single team delivers compliance across both the Investment Manager and the Trustee. This carries a structural limitation: Becky Barr is employed by the Investment Manager and holds B-class shares in the Manager, which may inhibit independent compliance oversight of the Investment Manager on the Trustee’s behalf. The Committee will identify this in the standing conflicts register and discuss at board level; a possible outcome is a change to Becky Barr's short-term incentive remuneration — potentially retaining B-class, or an alternative incentive of equal magnitude but differently structured.</w:t>
+        <w:t>It was noted that, at current scale, a single team delivers compliance across both the Investment Manager and the Trustee. This carries a structural limitation: Becky Barr is employed by the Investment Manager and holds B-class shares in the Manager, which may inhibit independent compliance oversight of the Investment Manager on the Trustee's behalf. The Committee will identify this in the standing conflicts register and discuss at board level; a possible outcome is a change to Becky Barr's short-term incentive remuneration — potentially retaining B-class, or an alternative incentive of equal magnitude but differently structured.</w:t>
       </w:r>
     </w:p>
     <w:p>
@@ -1348,7 +1348,7 @@
         <w:spacing w:after="60"/>
       </w:pPr>
       <w:r>
-        <w:t>Policies — "weeding the garden": tightening dates, cross-references and revision dates as part of Becky Barr’s annual review. A list of documents requiring formal revision dates may need to be enacted by board minute.</w:t>
+        <w:t>Policies — "weeding the garden": tightening dates, cross-references and revision dates as part of Becky Barr's annual review. A list of documents requiring formal revision dates may need to be enacted by board minute.</w:t>
       </w:r>
     </w:p>
     <w:p>
@@ -1584,7 +1584,7 @@
           </w:tcPr>
           <w:p>
             <w:r>
-              <w:t>Lead the search for an independent NED to the Trustee board (including meetings with Tony McVeigh and Randall this week; follow up Andrew O’Brien re David Nicholl introduction).</w:t>
+              <w:t>Lead the search for an independent NED to the Trustee board (including meetings with Tony McVeigh and Randall this week; follow up Andrew O'Brien re David Nicholl introduction).</w:t>
             </w:r>
           </w:p>
         </w:tc>
@@ -1626,7 +1626,7 @@
           </w:tcPr>
           <w:p>
             <w:r>
-              <w:t>Lead engagement with Yash and Kim Dema on valuation provider relationships, scope and budget; engage EY (auditors) re duplication; revert to Danny van Aswegen with scope/roadmap. Confirm Danny’s registered-valuer (ATO) status.</w:t>
+              <w:t>Lead engagement with Yash and Kim Dema on valuation provider relationships, scope and budget; engage EY (auditors) re duplication; revert to Danny van Aswegen with scope/roadmap. Confirm Danny's registered-valuer (ATO) status.</w:t>
             </w:r>
           </w:p>
         </w:tc>
@@ -1752,7 +1752,7 @@
           </w:tcPr>
           <w:p>
             <w:r>
-              <w:t>Identify Becky Barr’s B-class share / remuneration structural conflict in the standing conflicts register for board discussion; consider equal-magnitude alternative incentive structure.</w:t>
+              <w:t>Identify Becky Barr's B-class share / remuneration structural conflict in the standing conflicts register for board discussion; consider equal-magnitude alternative incentive structure.</w:t>
             </w:r>
           </w:p>
         </w:tc>

</xml_diff>